<commit_message>
IEIE draft: two-mechanism framing (thermo-elastic u + surface-diffusion h_d) stated in the introduction; mechanism-transition logic (recess 5 nm fixed, u at 400 C per size, 2u crossing by log interpolation) spelled out in 3.1
Co-Authored-By: Claude Fable 5.1 <noreply@anthropic.com>
</commit_message>
<xml_diff>
--- a/docs/paper/ieie2026f_blind_review_draft.docx
+++ b/docs/paper/ieie2026f_blind_review_draft.docx
@@ -368,6 +368,20 @@
           <w:i w:val="0"/>
           <w:sz w:val="18"/>
         </w:rPr>
+        <w:t>본 논문은 어닐 중 Cu 패드가 위로 솟는 양을 두 기구의 합으로 본다. (i) 열탄성 팽창 u: Cu와 유전체·Si의 열팽창 차이로 생기며 패드 부피에 비례하고, 식으면 되돌아간다. (ii) 표면확산 bulge-out h_d: 표면에너지·응력 구배를 줄이려고 Cu 원자가 패드 가장자리에서 중앙으로 이동해 생기며 어닐 온도·시간·표면 상태·결정 방위에 의존하고, 되돌아가지 않는다. 접촉 조건은 두 기구의 위·아래 합이 recess 합을 넘는 것이다. 두 기구는 패드 크기에 다르게 반응하므로, 어느 쪽이 접촉을 결정하는지가 크기에 따라 바뀐다 — 이 전환을 정량화하는 것이 본 연구의 출발점이다.</w:t>
+      </w:r>
+    </w:p>
+    <w:p>
+      <w:pPr>
+        <w:pStyle w:val="a4"/>
+      </w:pPr>
+      <w:r>
+        <w:rPr>
+          <w:rFonts w:ascii="바탕" w:hAnsi="바탕" w:eastAsia="바탕"/>
+          <w:b w:val="0"/>
+          <w:i w:val="0"/>
+          <w:sz w:val="18"/>
+        </w:rPr>
         <w:t>선행연구는 역할이 나뉘어 있다. Ayoub 등[4]은 300 nm 패드의 Laue 미세회절 편차 변형률과 COMSOL 해석으로 결정 방위에 따른 탄성 차이를 보였고, Lin·Chen 등[5,6]은 in-situ AFM으로 1–9 µm 패드의 돌출을 직접 쟀으며, imec[2,3,7]은 접합 후 상부 웨이퍼를 제거하고 수천 개 패드의 bulge-out 분포를 AFM·EBSD로 측정했다. 그러나 열탄성·표면확산·연결 단계를 하나의 공정창으로 묶고, 그 모델의 각 부분을 독립 실측으로 검증한 연구는 없다. 또한 기존 FEM은 벌크 물성으로 sub-µm 실측을 재현하지 못한다는 보고가 있다[8].</w:t>
       </w:r>
     </w:p>
@@ -509,7 +523,7 @@
           <w:i w:val="0"/>
           <w:sz w:val="18"/>
         </w:rPr>
-        <w:t>3.1 열탄성 모델: 학습·테스트와 기구 전환. Table 2에 결과를 요약했다. 학습값은 모두 문헌 범위의 끝(bound-limited)이었다. 테스트에서 NYCU 1 µm(모델 1.79–1.94 vs 실측 2.1 ± 0.4 nm)와 imec 1.26 µm 100–200 °C, 1.80 µm 전 온도는 통과했고, 미끄럼 측벽 대조군은 1 µm에서 1.7배, 0.54 µm에서 3.5배 과대예측하여 측벽이 접합 상태임이 판별되었다. 그러나 imec 0.54 µm는 100–400 °C 전 구간에서 측정/모델 비 0.61–0.69로 과대예측했다(비열적 오차; 단일 기하 가설 ≤7 %, 측정 정의 가설로도 모든 크기 동시 설명 불가). 사전 고정한 기준에 따라 탄성 모델은 0.54 µm에서 NOT VALIDATED로 동결했다. 이 결과를 recess와 함께 놓으면 기구 전환이 드러난다(Fig. 2): 위·아래 탄성 돌출 합이 recess 합 5 nm[10]를 넘는 크기는 실측 기준 ≈0.7 µm, 모델 기준 0.66–1.06 µm이고, 그 아래에서는 어떤 어닐 온도에서도 탄성만으로는 접촉이 안 된다(300 nm, 400 °C: 패드당 ≈1 nm).</w:t>
+        <w:t>3.1 열탄성 모델: 학습·테스트와 기구 전환. Table 2에 결과를 요약했다. 학습값은 모두 문헌 범위의 끝(bound-limited)이었다. 테스트에서 NYCU 1 µm(모델 1.79–1.94 vs 실측 2.1 ± 0.4 nm)와 imec 1.26 µm 100–200 °C, 1.80 µm 전 온도는 통과했고, 미끄럼 측벽 대조군은 1 µm에서 1.7배, 0.54 µm에서 3.5배 과대예측하여 측벽이 접합 상태임이 판별되었다. 그러나 imec 0.54 µm는 100–400 °C 전 구간에서 측정/모델 비 0.61–0.69로 과대예측했다(비열적 오차; 단일 기하 가설 ≤7 %, 측정 정의 가설로도 모든 크기 동시 설명 불가). 사전 고정한 기준에 따라 탄성 모델은 0.54 µm에서 NOT VALIDATED로 동결했다. 이 결과를 recess와 함께 놓으면 기구 전환이 드러난다(Fig. 2). 절차는 다음과 같다: recess 합을 IRPS 2026 실측 평균 5 nm[10]로 고정하고, 크기별 열탄성 돌출 u를 공정 상한 400 °C에서 취해(실측: imec in-situ 0.54/1.26/1.80/3.06 µm; 모델: 같은 크기의 FEM), 위·아래 합 2u가 5 nm를 넘는 최소 크기를 log(크기) 보간으로 구한다. 실측 기준 ≈0.7 µm(0.54 µm에서 2.8 nm, 1.26 µm에서 10 nm 사이), 모델 기준 0.66 µm(b = 1)–1.06 µm(b = 0.69)이다. 그 아래에서는 공정 상한 온도에서도 탄성만으로는 접촉이 안 되며(300 nm, 400 °C: 패드당 ≈1 nm, 틈의 1/5), 실제로 200–400 nm 피치 본딩이 성립하는 것[1]은 다른 기구(표면확산)가 틈을 메운다는 뜻이다. 전환 크기는 recess 합과 어닐 온도의 함수이며(recess가 작거나 온도가 높으면 작아짐), 여기서는 그 기준 조건에서의 값이다.</w:t>
       </w:r>
     </w:p>
     <w:p>

</xml_diff>

<commit_message>
Round X2 results (liner hypothesis rejected; C(h/w) surrogate 4/4 within 20 %); integration v3: paper core message (transition rule + surrogate, interface state = process input, <111> tail governs the window, Q_eff 13 and scope), report §15, Claude Science prompt update, HANDOFF, CHANGELOG
Co-Authored-By: Claude Fable 5.1 <noreply@anthropic.com>
</commit_message>
<xml_diff>
--- a/docs/paper/ieie2026f_blind_review_draft.docx
+++ b/docs/paper/ieie2026f_blind_review_draft.docx
@@ -523,7 +523,7 @@
           <w:i w:val="0"/>
           <w:sz w:val="18"/>
         </w:rPr>
-        <w:t>3.1 열탄성 모델: 학습·테스트와 기구 전환. Table 2에 결과를 요약했다. 학습값은 모두 문헌 범위의 끝(bound-limited)이었다. 테스트에서 NYCU 1 µm(모델 1.79–1.94 vs 실측 2.1 ± 0.4 nm)와 imec 1.26 µm 100–200 °C, 1.80 µm 전 온도는 통과했고, 미끄럼 측벽 대조군은 1 µm에서 1.7배, 0.54 µm에서 3.5배 과대예측하여 측벽이 접합 상태임이 판별되었다. 그러나 imec 0.54 µm는 100–400 °C 전 구간에서 측정/모델 비 0.61–0.69로 과대예측했다(비열적 오차; 단일 기하 가설 ≤7 %, 측정 정의 가설로도 모든 크기 동시 설명 불가). 사전 고정한 기준에 따라 탄성 모델은 0.54 µm에서 NOT VALIDATED로 동결했다. 이 결과를 recess와 함께 놓으면 기구 전환이 드러난다(Fig. 2). 절차는 다음과 같다: recess 합을 IRPS 2026 실측 평균 5 nm[10]로 고정하고, 크기별 열탄성 돌출 u를 공정 상한 400 °C에서 취해(실측: imec in-situ 0.54/1.26/1.80/3.06 µm; 모델: 같은 크기의 FEM), 위·아래 합 2u가 5 nm를 넘는 최소 크기를 log(크기) 보간으로 구한다. 실측 기준 ≈0.7 µm(0.54 µm에서 2.8 nm, 1.26 µm에서 10 nm 사이), 모델 기준 0.66 µm(b = 1)–1.06 µm(b = 0.69)이다. 그 아래에서는 공정 상한 온도에서도 탄성만으로는 접촉이 안 되며(300 nm, 400 °C: 패드당 ≈1 nm, 틈의 1/5), 실제로 200–400 nm 피치 본딩이 성립하는 것[1]은 다른 기구(표면확산)가 틈을 메운다는 뜻이다. 전환 크기는 recess 합과 어닐 온도의 함수이며(recess가 작거나 온도가 높으면 작아짐), 여기서는 그 기준 조건에서의 값이다.</w:t>
+        <w:t>3.1 열탄성 모델: 학습·테스트와 기구 전환. Table 2에 결과를 요약했다. 학습값은 모두 문헌 범위의 끝(bound-limited)이었다. 테스트에서 NYCU 1 µm(모델 1.79–1.94 vs 실측 2.1 ± 0.4 nm)와 imec 1.26 µm 100–200 °C, 1.80 µm 전 온도는 통과했고, 미끄럼 측벽 대조군은 1 µm에서 1.7배, 0.54 µm에서 3.5배 과대예측하여 측벽이 접합 상태임이 판별되었다. 그러나 imec 0.54 µm는 100–400 °C 전 구간에서 측정/모델 비 0.61–0.69로 과대예측했다(비열적 오차; 단일 기하 가설 ≤7 %, 측정 정의 가설로도 모든 크기 동시 설명 불가). 사전 고정한 기준에 따라 탄성 모델은 0.54 µm에서 NOT VALIDATED로 동결했다. 탄성 결과 전체(FEM 167런, 실측 19점)는 구속 계수 C = u/[(α_Cu − α_Si)ΔT·h]가 종횡비 h/w의 한 함수 C = c₀/[1 + a(E_d/E_Cu)(h/w)^1.5](배열 셀 c₀ 1.95, a 2.2)로 붕괴하고, 사전등록한 미사용 기하 4개(X35–X38)에서 ±20 % 안에 들어 대리식으로 쓸 수 있다; 0.54 µm 실측만 곡선에서 이탈한다(측정/모델 0.61–0.69, 전 온도). 라이너 두께 15·25 nm(X30–X34)는 u를 바꾸지 않아(+0.3 %) 마지막 탄성 가설도 닫혔다. 이 결과를 recess와 함께 놓으면 기구 전환이 드러난다(Fig. 2). 절차는 다음과 같다: recess 합을 IRPS 2026 실측 평균 5 nm[10]로 고정하고, 크기별 열탄성 돌출 u를 공정 상한 400 °C에서 취해(실측: imec in-situ 0.54/1.26/1.80/3.06 µm; 모델: 같은 크기의 FEM), 위·아래 합 2u가 5 nm를 넘는 최소 크기를 log(크기) 보간으로 구한다. 실측 기준 ≈0.7 µm(0.54 µm에서 2.8 nm, 1.26 µm에서 10 nm 사이), 모델 기준 0.66 µm(b = 1)–1.06 µm(b = 0.69)이다. 그 아래에서는 공정 상한 온도에서도 탄성만으로는 접촉이 안 되며(300 nm, 400 °C: 패드당 ≈1 nm, 틈의 1/5), 실제로 200–400 nm 피치 본딩이 성립하는 것[1]은 다른 기구(표면확산)가 틈을 메운다는 뜻이다. 전환 크기는 recess 합과 어닐 온도의 함수이며(recess가 작거나 온도가 높으면 작아짐), 여기서는 그 기준 조건에서의 값이다.</w:t>
       </w:r>
     </w:p>
     <w:p>
@@ -1259,7 +1259,7 @@
           <w:i w:val="0"/>
           <w:sz w:val="18"/>
         </w:rPr>
-        <w:t>3.2 표면확산 항 테스트. 고정형(θ = 123°, τ₀ 학습)은 17점 중 2점만 통과했다: 학습점(350 °C 1 h)이 동역학적으로 포화 상태라 진폭 오차가 τ₀로 잘못 흡수된 탓이다. 문서화된 개정 1(진폭 θ_eff 학습, τ₀ 60 s 고정)에서 θ_eff = 113.6°, 11/17 통과, 온도 경향 통과, 포화 비 경계 실패로 규칙상 NOT VALIDATED이나, 실패 6점은 모두 200 °C·D ≥ 250 nm 또는 자가 어닐 Cu의 과소예측이고 250 °C 이상 PPA-Cu 전 점과 ≤140 nm 패드 200 °C는 10/10 통과했다(Fig. 3). 즉 식 (1)은 250 °C 이상에서 실측과 맞고 200 °C에서는 보수적이다(측정의 2 h→4 h 증가율로 추정한 유효 활성화에너지 14–17 kcal/mol은 문헌 20.7보다 작다). 방위 항을 넣은 2차 탐색(θ_eff 119°, ω_c 5°, Δω 19.5°)은 중앙값 통과율을 바꾸지 않지만 분포 폭(IQR)을 10/17 재현했다 — 방위가 없는 모델의 IQR은 0이다.</w:t>
+        <w:t>3.2 표면확산 항 테스트와 유효 활성화에너지. 고정형(θ = 123°, τ₀ 학습)은 17점 중 2점만 통과했다: 학습점(350 °C 1 h)이 동역학적으로 포화 상태라 진폭 오차가 τ₀로 잘못 흡수된 탓이다. 문서화된 개정 1(진폭 θ_eff 학습, τ₀ 60 s 고정)에서 θ_eff = 113.6°, 11/17 통과, 온도 경향 통과, 포화 비 경계 실패로 규칙상 NOT VALIDATED이나, 실패 6점은 모두 200 °C·D ≥ 250 nm 또는 자가 어닐 Cu의 과소예측이고 250 °C 이상 PPA-Cu 전 점과 ≤140 nm 패드 200 °C는 10/10 통과했다(Fig. 3). 즉 식 (1)은 250 °C 이상에서 실측과 맞고 200 °C에서는 보수적이다(측정의 2 h→4 h 증가율로 추정한 유효 활성화에너지 14–17 kcal/mol은 문헌 20.7보다 작다). 방위 항을 넣은 2차 탐색(θ_eff 119°, ω_c 5°, Δω 19.5°)은 중앙값 통과율을 바꾸지 않지만 분포 폭(IQR)을 10/17 재현하고 lagging tail(&lt; 6.5 nm) 분율 8 %(실측 ≈ 10 %)를 준다 — 방위가 없는 모델의 IQR은 0이다. 사후 분석(마스터 커브): PPA-Cu 10점은 h = a·D·[1 − exp(−t_eff/τ₀)]에 Q_eff = 13.4 kcal/mol(CI 12.5–14.8; Butrymowicz 집계의 저온 전계방출값 13과 일치)로 한 곡선에 붕괴하고(rms 0.49 nm &lt; 판독 오차 0.70), 등가 규칙 350 °C × 1 h ≡ 300 °C × 2.6 h ≡ 250 °C × 7.9 h를 준다; 자가 어닐 Cu는 진폭이 아니라 동역학이 3배 빠르다. 이 모델을 고정해 미사용 데이터(DM2023, cavity/pad ≤ 0.5)로 다시 테스트한 라운드 3는 0/7(개정 후 4/7)로 실패했다: 등크기 패드 항은 불균등 패드 구조로 전이되지 않는다(DM2023 자체의 '비율이 지배' 관찰과 일치) — 적용 범위는 등크기 접합이다.</w:t>
       </w:r>
     </w:p>
     <w:p>
@@ -1303,7 +1303,7 @@
           <w:i w:val="0"/>
           <w:sz w:val="18"/>
         </w:rPr>
-        <w:t>3.3 Ayoub 300 nm 변형률. 같은 적층(SiN 캡, Ta 13 nm)의 접합 모델은 3 µm 패드에서 ε′zz 부호가 실측[4]과 일치했고(−1.24 × 10⁻³ vs −0.35…−2 × 10⁻³), 300 nm에서는 두 방위(E_z 68·190 GPa)의 가열 기울기 크기가 0.5 % 안에 들되 부호가 반대였다. Ayoub 시료는 다른 공정(Cu/SiO2, CMP 후 PECVD SiN 캡)이고 Cu 계면 조건이 명시돼 있지 않으므로 계면 상태 차이(캡·측벽)로 해석하되 가설로 둔다. 크기 재현은 주장하지 않는다.</w:t>
+        <w:t>3.3 계면 상태는 공정 입력이다 (Ayoub 변형률·Lhostis TEM). 접촉 FEM으로 Lhostis 2024의 HRTEM 관찰을 시험했다: 접합 모델은 폭 효과(110 nm 폭 패드의 중심 void 분율 0.62 vs 360 nm 0.10, held-out 규칙 통과)를 재현하지만 두께 효과(650 nm 닫힘, 220 nm void)는 어떤 지표로도 내지 못한다(A_c·void 분율 차 ≤ 0.13; 접합 측벽이 두꺼운 패드의 수직 팽창을 절반으로 누르고 얇은 패드는 면내 압축 압출이 보태 u_rel ∝ w). 측벽을 이완(미끄럼)시키면 650 nm는 완전 닫힘(V 0.000/0.24), 220 nm는 void(0.15/0.54; r0 2/4 nm)로 두께 효과가 나온다. 같은 공정(ST/Leti Cu/SiO2)의 Ayoub 300 nm 변형률도 캡·측벽이 이완일 때만 부호가 맞는다(아래). imec·NYCU 돌출은 접합을 요구한다(V4). 따라서 계면 상태는 공정마다 다른 입력이며, 그 판별 자체가 모델의 쓸모다.  같은 적층(SiN 캡, Ta 13 nm)의 접합 모델은 3 µm 패드에서 ε′zz 부호가 실측[4]과 일치했고(−1.24 × 10⁻³ vs −0.35…−2 × 10⁻³), 300 nm에서는 두 방위(E_z 68·190 GPa)의 가열 기울기 크기가 0.5 % 안에 들되 부호가 반대였다. Ayoub 시료는 다른 공정(Cu/SiO2, CMP 후 PECVD SiN 캡)이고 Cu 계면 조건이 명시돼 있지 않으므로 계면 상태 차이(캡·측벽)로 해석하되 가설로 둔다. 크기 재현은 주장하지 않는다.</w:t>
       </w:r>
     </w:p>
     <w:p>
@@ -1317,7 +1317,7 @@
           <w:i w:val="0"/>
           <w:sz w:val="18"/>
         </w:rPr>
-        <w:t>3.4 300 nm 공정창과 레시피 변수. 탄성 항(b = 0.69, 0.54 µm 테스트 비의 범위 0.60–1.0로 반복)과 식 (1)(방위 항 포함)의 단순합으로, 상·하 방위(구면 균일)와 recess(패드당 N(2.5, 0.5²) nm[10]) 2 × 10⁵ 쌍에 대해 P_contact를 계산했다(Fig. 4). 청정 표면(표준 접합 전 세정)에서 창은 250 °C × 2 h 또는 300 °C × 30 min부터 열리고, 350 °C 이상은 5 min이면 충분하다. 불확실 집합 b × τ₀{20, 60, 100 s} × Q{20.7, 15}에서 바뀌는 셀은 경계 3개뿐이며, 권고 레시피는 b 전 범위에서 같다(탄성 항은 총 돌출의 ~8 %). 표면 산화(s_ox 0.45)는 창을 한 단계(50 °C 또는 한 시간 등급) 좁힌다. 같은 계산을 recess 평균에 대해 풀면 CMP에 돌려줄 허용 사양이 나온다(Fig. 5): 250 °C × 2 h에서 recess 합 ≤ 7.5 nm, 300 °C × 30 min에서 ≤ 9 nm, 350 °C 이상에서 ≤ 11.5 nm(산화 표면은 절반). 인자 순위(창에서 바뀌는 셀 수, Fig. 6a)는 지배 기구(확산 off: 9/15) ≫ 확산 동역학 τ₀(2) ≈ &lt;111&gt; facet(2) ≈ 라이너 접촉각(2) &gt; 표면 상태(3, 산화 쪽) &gt; recess 평균·산포(0)·b(0) 순이다. 방위는 탄성 항(폭 4 %)이 아니라 확산 항을 통해 들어오며, 총 돌출의 방위 폭은 0.30 µm에서 11 nm(탄성 0.03 nm)이다. &lt;111&gt; 근방 패드(f &lt; 0.5, 전체의 13 %)는 bulge-out이 작아 최적 어닐에서도 미접촉 쌍이 ≈1.4 × 10⁻³ 남는다(Fig. 6b); 미세결정 Cu로 꼬리를 없애면 이 하한이 사라진다[3]. 접촉 후 연결 단계(2D 축대칭 Cu–Cu 마찰 접촉, 등방 소성)에서는 300 nm·350 °C·recess 1–2 nm에서 접촉면적 분율 0.95–1.0, 평균 접촉압력 317–403 MPa로 재결정의 필요조건을 만족하나 접합의 증명은 아니다.</w:t>
+        <w:t>3.4 300 nm 공정창: 어닐이 아니라 &lt;111&gt; 꼬리가 정한다. 탄성 항(b = 0.69, 0.54 µm 테스트 비의 범위 0.60–1.0로 반복)과 식 (1)(방위 항 포함)의 단순합으로, 상·하 방위(구면 균일)와 recess(패드당 N(2.5, 0.5²) nm[10]) 2 × 10⁵ 쌍에 대해 P_contact를 계산했다(Fig. 4). 청정 표면(표준 접합 전 세정)에서 창은 250 °C × 2 h 또는 300 °C × 30 min부터 열리고, 350 °C 이상은 5 min이면 충분하다. 불확실 집합 b × τ₀{20, 60, 100 s} × Q{20.7, 15}에서 바뀌는 셀은 경계 3개뿐이며, 권고 레시피는 b 전 범위에서 같다(탄성 항은 총 돌출의 ~8 %). 표면 산화(s_ox 0.45)는 창을 한 단계(50 °C 또는 한 시간 등급) 좁힌다. 같은 계산을 recess 평균에 대해 풀면 CMP에 돌려줄 허용 사양이 나온다(Fig. 5): 250 °C × 2 h에서 recess 합 ≤ 7.5 nm, 300 °C × 30 min에서 ≤ 9 nm, 350 °C 이상에서 ≤ 11.5 nm(산화 표면은 절반). 인자 순위(창에서 바뀌는 셀 수, Fig. 6a)는 지배 기구(확산 off: 9/15) ≫ 확산 동역학 τ₀(2) ≈ &lt;111&gt; facet(2) ≈ 라이너 접촉각(2) &gt; 표면 상태(3, 산화 쪽) &gt; recess 평균·산포(0)·b(0) 순이다. 방위는 탄성 항(폭 4 %)이 아니라 확산 항을 통해 들어오며, 총 돌출의 방위 폭은 0.30 µm에서 11 nm(탄성 0.03 nm)이다. &lt;111&gt; 근방 패드(f &lt; 0.5, 전체의 13 %)는 bulge-out이 작아 최적 어닐에서도 미접촉 쌍이 ≈1.4 × 10⁻³(청정, 250 °C 2 h 3.4 × 10⁻³) 남는다(Fig. 6b). 꼬리 모양에 대한 민감도: lagging 10 %를 전부 완전 facet으로 두면 미접촉 2–4 %가 되어 P ≥ 0.99 셀이 하나도 남지 않는다 — 즉 300 nm의 P ≥ 0.99 창은 어닐이 아니라 &lt;111&gt; 꼬리가 정하며, 대립 Cu로는 어닐을 늘려도 하한을 못 없앤다. 미세결정 Cu로 꼬리를 없애면(f ≡ 1) 하한 0, 창 11/15[3]. 데이지체인으로 환산하면(독립 링크 가정) 대립 Cu는 ≈ 500 링크에서 수율 50 %에 이르는 체인 길이 상한을 가지며 fg-Cu는 그 상한이 없다 — 검증 가능한 예측(탐색). 같은 계산에서 2025–26년 접합기의 오버레이(σ ≈ 10–12 nm)는 300 nm 패드의 미접촉에 ≤ 10⁻⁵만 기여하므로 수율 한계 인자는 오버레이에서 방위로 옮겨간다. 접촉 후 연결 단계(2D 축대칭 Cu–Cu 마찰 접촉, 등방 소성)에서는 300 nm·350 °C·recess 1–2 nm에서 접촉면적 분율 0.95–1.0, 평균 접촉압력 317–403 MPa로 재결정의 필요조건을 만족하나 접합의 증명은 아니다.</w:t>
       </w:r>
     </w:p>
     <w:p>

</xml_diff>